<commit_message>
feat(liste-attente): refus d une inscription automatique = retour en file a sa place
Quand un gestionnaire REFUSE (supprime, non validee) une reservation obtenue par
inscription automatique, l usager retrouve sa place dans la liste d attente : entree
recreee avec sa date d inscription d origine, ses disponibilites, ses periodes et son
choix d inscription automatique ; la ligne AUTO_BOOKED de l historique est retiree (le
placement n a pas tenu). Sans effet si une entree vivante existe deja. Journal
« liste-attente ». Une reservation validee puis supprimee, ou annulee par l usager, ne
remet personne en file. Cas vecu en production le 2026-09-16 (Dom).

Fonction requeueRefusedAutoBookings (waiting-list-close.ts) appelee dans la transaction
de deleteBookingAdminAction avant la trace de suppression ; 3 tests ; guide usager et
gestionnaire, aide integree et Word mis a jour.

Co-Authored-By: Claude Fable 5.1 <noreply@anthropic.com>
</commit_message>
<xml_diff>
--- a/docs/Guide-usager.docx
+++ b/docs/Guide-usager.docx
@@ -1538,7 +1538,27 @@
         <w:t xml:space="preserve">Toute réservation obtenue</w:t>
       </w:r>
       <w:r>
-        <w:t xml:space="preserve"> sur le service — faite par vous, par un gestionnaire ou automatiquement — vous retire de la liste. La liste vous est aussi proposée au bon moment : un clic sur un créneau </w:t>
+        <w:t xml:space="preserve"> sur le service — faite par vous, par un gestionnaire ou automatiquement — vous retire de la liste. Si le service </w:t>
+      </w:r>
+      <w:r>
+        <w:rPr>
+          <w:b/>
+          <w:bCs/>
+        </w:rPr>
+        <w:t xml:space="preserve">refuse</w:t>
+      </w:r>
+      <w:r>
+        <w:t xml:space="preserve"> une réservation qui vous avait été faite automatiquement, vous </w:t>
+      </w:r>
+      <w:r>
+        <w:rPr>
+          <w:b/>
+          <w:bCs/>
+        </w:rPr>
+        <w:t xml:space="preserve">retrouvez votre place</w:t>
+      </w:r>
+      <w:r>
+        <w:t xml:space="preserve"> dans la liste, avec vos disponibilités et votre date d'inscription d'origine : l'e-mail de refus vaut alors information, il n'y a rien à refaire. La liste vous est aussi proposée au bon moment : un clic sur un créneau </w:t>
       </w:r>
       <w:r>
         <w:rPr>

</xml_diff>